<commit_message>
integrate: W1 regen outputs and adapter sync
Real artifacts from O1/O2 spec registration: signature paragraphs become
real w:tbl blocks (2x1 / 1x1) in PLI_M70/M71, form_maps gains
section_specs, dispatcher anchors adapted (match on table text; M71 span
ends before national-separator line), production-fixture assertions read
grid cells instead of legacy paragraph roles.

Co-Authored-By: Claude <noreply@anthropic.com>
</commit_message>
<xml_diff>
--- a/app/templates/PLI_M70.docx
+++ b/app/templates/PLI_M70.docx
@@ -362,6 +362,58 @@
         <w:t>Nơi nhận kết quả bản giấy (nếu có): {noi_nhan}</w:t>
       </w:r>
     </w:p>
+    <w:tbl xmlns:ns0="urn:orca:p1b-temp">
+      <w:tblPr>
+        <w:tblW w:type="auto" w:w="0"/>
+        <w:tblLook w:firstColumn="1" w:firstRow="1" w:lastColumn="0" w:lastRow="0" w:noHBand="0" w:noVBand="1" w:val="04A0"/>
+        <w:tblBorders>
+          <w:top w:val="single" w:sz="4" w:color="000000"/>
+          <w:left w:val="single" w:sz="4" w:color="000000"/>
+          <w:bottom w:val="single" w:sz="4" w:color="000000"/>
+          <w:right w:val="single" w:sz="4" w:color="000000"/>
+          <w:insideH w:val="single" w:sz="4" w:color="000000"/>
+          <w:insideV w:val="single" w:sz="4" w:color="000000"/>
+        </w:tblBorders>
+      </w:tblPr>
+      <w:tblGrid>
+        <w:gridCol w:w="8640"/>
+      </w:tblGrid>
+      <w:tr>
+        <w:tc>
+          <w:tcPr>
+            <w:tcW w:type="dxa" w:w="8640"/>
+          </w:tcPr>
+          <w:p>
+            <w:r>
+              <w:rPr>
+                <w:b/>
+              </w:rPr>
+              <w:t>NGƯỜI NỘP</w:t>
+              <w:br/>
+              <w:t>(Ký và ghi họ tên)</w:t>
+            </w:r>
+          </w:p>
+        </w:tc>
+      </w:tr>
+      <w:tr>
+        <w:tc>
+          <w:tcPr>
+            <w:tcW w:type="dxa" w:w="8640"/>
+          </w:tcPr>
+          <w:p>
+            <w:r>
+              <w:rPr>
+                <w:b/>
+              </w:rPr>
+              <w:t>NGƯỜI NHẬN</w:t>
+              <w:br/>
+              <w:t>(Ký và ghi họ tên)</w:t>
+            </w:r>
+          </w:p>
+        </w:tc>
+      </w:tr>
+    </w:tbl>
+    <w:p/>
     <w:p>
       <w:pPr>
         <w:spacing w:before="120"/>
@@ -373,99 +425,6 @@
           <w:sz-cs w:val="24"/>
         </w:rPr>
         <w:t xml:space="preserve"/>
-      </w:r>
-    </w:p>
-    <w:p>
-      <w:pPr>
-        <w:jc w:val="center"/>
-        <w:spacing w:before="120"/>
-      </w:pPr>
-      <w:r>
-        <w:rPr>
-          <w:rFonts w:ascii="Arial" w:hAnsi="Arial" w:cs="Arial"/>
-          <w:sz w:val="24"/>
-          <w:sz-cs w:val="24"/>
-          <w:b/>
-        </w:rPr>
-        <w:t xml:space="preserve">NGƯỜI NỘP</w:t>
-        <w:br/>
-        <w:t xml:space="preserve"/>
-      </w:r>
-      <w:r>
-        <w:rPr>
-          <w:rFonts w:ascii="Arial" w:hAnsi="Arial" w:cs="Arial"/>
-          <w:sz w:val="24"/>
-          <w:sz-cs w:val="24"/>
-        </w:rPr>
-        <w:t xml:space="preserve">(</w:t>
-      </w:r>
-      <w:r>
-        <w:rPr>
-          <w:rFonts w:ascii="Arial" w:hAnsi="Arial" w:cs="Arial"/>
-          <w:sz w:val="24"/>
-          <w:sz-cs w:val="24"/>
-          <w:i/>
-        </w:rPr>
-        <w:t xml:space="preserve">Ký và ghi họ tên</w:t>
-      </w:r>
-      <w:r>
-        <w:rPr>
-          <w:rFonts w:ascii="Arial" w:hAnsi="Arial" w:cs="Arial"/>
-          <w:sz w:val="24"/>
-          <w:sz-cs w:val="24"/>
-        </w:rPr>
-        <w:t xml:space="preserve">)</w:t>
-      </w:r>
-      <w:r>
-        <w:rPr>
-          <w:rFonts w:ascii="Arial" w:hAnsi="Arial" w:cs="Arial"/>
-          <w:sz w:val="24"/>
-          <w:sz-cs w:val="24"/>
-          <w:b/>
-        </w:rPr>
-        <w:t xml:space="preserve"/>
-      </w:r>
-    </w:p>
-    <w:p>
-      <w:pPr>
-        <w:jc w:val="center"/>
-        <w:spacing w:before="120"/>
-      </w:pPr>
-      <w:r>
-        <w:rPr>
-          <w:rFonts w:ascii="Arial" w:hAnsi="Arial" w:cs="Arial"/>
-          <w:sz w:val="24"/>
-          <w:sz-cs w:val="24"/>
-          <w:b/>
-        </w:rPr>
-        <w:t xml:space="preserve">NGƯỜI NHẬN</w:t>
-        <w:br/>
-        <w:t xml:space="preserve"/>
-      </w:r>
-      <w:r>
-        <w:rPr>
-          <w:rFonts w:ascii="Arial" w:hAnsi="Arial" w:cs="Arial"/>
-          <w:sz w:val="24"/>
-          <w:sz-cs w:val="24"/>
-        </w:rPr>
-        <w:t xml:space="preserve">(</w:t>
-      </w:r>
-      <w:r>
-        <w:rPr>
-          <w:rFonts w:ascii="Arial" w:hAnsi="Arial" w:cs="Arial"/>
-          <w:sz w:val="24"/>
-          <w:sz-cs w:val="24"/>
-          <w:i/>
-        </w:rPr>
-        <w:t xml:space="preserve">Ký và ghi họ tên</w:t>
-      </w:r>
-      <w:r>
-        <w:rPr>
-          <w:rFonts w:ascii="Arial" w:hAnsi="Arial" w:cs="Arial"/>
-          <w:sz w:val="24"/>
-          <w:sz-cs w:val="24"/>
-        </w:rPr>
-        <w:t xml:space="preserve">)</w:t>
       </w:r>
     </w:p>
     <w:p>
@@ -487,6 +446,192 @@
     </w:sectPr>
   </w:body>
 </w:document>
+</file>
+
+<file path=word/styles.xml><?xml version="1.0" encoding="utf-8"?>
+<w:styles xmlns:mc="http://schemas.openxmlformats.org/markup-compatibility/2006" xmlns:r="http://schemas.openxmlformats.org/officeDocument/2006/relationships" xmlns:w14="http://schemas.microsoft.com/office/word/2010/wordml" xmlns:w="http://schemas.openxmlformats.org/wordprocessingml/2006/main" mc:Ignorable="w14">
+  <w:docDefaults>
+    <w:rPrDefault>
+      <w:rPr>
+        <w:rFonts w:asciiTheme="minorHAnsi" w:eastAsiaTheme="minorEastAsia" w:hAnsiTheme="minorHAnsi" w:cstheme="minorBidi"/>
+        <w:sz w:val="24"/>
+        <w:szCs w:val="24"/>
+        <w:lang w:val="en-US" w:eastAsia="en-US" w:bidi="ar-SA"/>
+      </w:rPr>
+    </w:rPrDefault>
+    <w:pPrDefault/>
+  </w:docDefaults>
+  <w:latentStyles w:defLockedState="0" w:defUIPriority="99" w:defSemiHidden="1" w:defUnhideWhenUsed="1" w:defQFormat="0" w:count="276">
+    <w:lsdException w:name="Normal" w:semiHidden="0" w:uiPriority="0" w:unhideWhenUsed="0" w:qFormat="1"/>
+    <w:lsdException w:name="heading 1" w:semiHidden="0" w:uiPriority="9" w:unhideWhenUsed="0" w:qFormat="1"/>
+    <w:lsdException w:name="heading 2" w:uiPriority="9" w:qFormat="1"/>
+    <w:lsdException w:name="heading 3" w:uiPriority="9" w:qFormat="1"/>
+    <w:lsdException w:name="heading 4" w:uiPriority="9" w:qFormat="1"/>
+    <w:lsdException w:name="heading 5" w:uiPriority="9" w:qFormat="1"/>
+    <w:lsdException w:name="heading 6" w:uiPriority="9" w:qFormat="1"/>
+    <w:lsdException w:name="heading 7" w:uiPriority="9" w:qFormat="1"/>
+    <w:lsdException w:name="heading 8" w:uiPriority="9" w:qFormat="1"/>
+    <w:lsdException w:name="heading 9" w:uiPriority="9" w:qFormat="1"/>
+    <w:lsdException w:name="toc 1" w:uiPriority="39"/>
+    <w:lsdException w:name="toc 2" w:uiPriority="39"/>
+    <w:lsdException w:name="toc 3" w:uiPriority="39"/>
+    <w:lsdException w:name="toc 4" w:uiPriority="39"/>
+    <w:lsdException w:name="toc 5" w:uiPriority="39"/>
+    <w:lsdException w:name="toc 6" w:uiPriority="39"/>
+    <w:lsdException w:name="toc 7" w:uiPriority="39"/>
+    <w:lsdException w:name="toc 8" w:uiPriority="39"/>
+    <w:lsdException w:name="toc 9" w:uiPriority="39"/>
+    <w:lsdException w:name="caption" w:uiPriority="35" w:qFormat="1"/>
+    <w:lsdException w:name="Title" w:semiHidden="0" w:uiPriority="10" w:unhideWhenUsed="0" w:qFormat="1"/>
+    <w:lsdException w:name="Default Paragraph Font" w:uiPriority="1"/>
+    <w:lsdException w:name="Subtitle" w:semiHidden="0" w:uiPriority="11" w:unhideWhenUsed="0" w:qFormat="1"/>
+    <w:lsdException w:name="Strong" w:semiHidden="0" w:uiPriority="22" w:unhideWhenUsed="0" w:qFormat="1"/>
+    <w:lsdException w:name="Emphasis" w:semiHidden="0" w:uiPriority="20" w:unhideWhenUsed="0" w:qFormat="1"/>
+    <w:lsdException w:name="Table Grid" w:semiHidden="0" w:uiPriority="59" w:unhideWhenUsed="0"/>
+    <w:lsdException w:name="Placeholder Text" w:unhideWhenUsed="0"/>
+    <w:lsdException w:name="No Spacing" w:semiHidden="0" w:uiPriority="1" w:unhideWhenUsed="0" w:qFormat="1"/>
+    <w:lsdException w:name="Light Shading" w:semiHidden="0" w:uiPriority="60" w:unhideWhenUsed="0"/>
+    <w:lsdException w:name="Light List" w:semiHidden="0" w:uiPriority="61" w:unhideWhenUsed="0"/>
+    <w:lsdException w:name="Light Grid" w:semiHidden="0" w:uiPriority="62" w:unhideWhenUsed="0"/>
+    <w:lsdException w:name="Medium Shading 1" w:semiHidden="0" w:uiPriority="63" w:unhideWhenUsed="0"/>
+    <w:lsdException w:name="Medium Shading 2" w:semiHidden="0" w:uiPriority="64" w:unhideWhenUsed="0"/>
+    <w:lsdException w:name="Medium List 1" w:semiHidden="0" w:uiPriority="65" w:unhideWhenUsed="0"/>
+    <w:lsdException w:name="Medium List 2" w:semiHidden="0" w:uiPriority="66" w:unhideWhenUsed="0"/>
+    <w:lsdException w:name="Medium Grid 1" w:semiHidden="0" w:uiPriority="67" w:unhideWhenUsed="0"/>
+    <w:lsdException w:name="Medium Grid 2" w:semiHidden="0" w:uiPriority="68" w:unhideWhenUsed="0"/>
+    <w:lsdException w:name="Medium Grid 3" w:semiHidden="0" w:uiPriority="69" w:unhideWhenUsed="0"/>
+    <w:lsdException w:name="Dark List" w:semiHidden="0" w:uiPriority="70" w:unhideWhenUsed="0"/>
+    <w:lsdException w:name="Colorful Shading" w:semiHidden="0" w:uiPriority="71" w:unhideWhenUsed="0"/>
+    <w:lsdException w:name="Colorful List" w:semiHidden="0" w:uiPriority="72" w:unhideWhenUsed="0"/>
+    <w:lsdException w:name="Colorful Grid" w:semiHidden="0" w:uiPriority="73" w:unhideWhenUsed="0"/>
+    <w:lsdException w:name="Light Shading Accent 1" w:semiHidden="0" w:uiPriority="60" w:unhideWhenUsed="0"/>
+    <w:lsdException w:name="Light List Accent 1" w:semiHidden="0" w:uiPriority="61" w:unhideWhenUsed="0"/>
+    <w:lsdException w:name="Light Grid Accent 1" w:semiHidden="0" w:uiPriority="62" w:unhideWhenUsed="0"/>
+    <w:lsdException w:name="Medium Shading 1 Accent 1" w:semiHidden="0" w:uiPriority="63" w:unhideWhenUsed="0"/>
+    <w:lsdException w:name="Medium Shading 2 Accent 1" w:semiHidden="0" w:uiPriority="64" w:unhideWhenUsed="0"/>
+    <w:lsdException w:name="Medium List 1 Accent 1" w:semiHidden="0" w:uiPriority="65" w:unhideWhenUsed="0"/>
+    <w:lsdException w:name="Revision" w:unhideWhenUsed="0"/>
+    <w:lsdException w:name="List Paragraph" w:semiHidden="0" w:uiPriority="34" w:unhideWhenUsed="0" w:qFormat="1"/>
+    <w:lsdException w:name="Quote" w:semiHidden="0" w:uiPriority="29" w:unhideWhenUsed="0" w:qFormat="1"/>
+    <w:lsdException w:name="Intense Quote" w:semiHidden="0" w:uiPriority="30" w:unhideWhenUsed="0" w:qFormat="1"/>
+    <w:lsdException w:name="Medium List 2 Accent 1" w:semiHidden="0" w:uiPriority="66" w:unhideWhenUsed="0"/>
+    <w:lsdException w:name="Medium Grid 1 Accent 1" w:semiHidden="0" w:uiPriority="67" w:unhideWhenUsed="0"/>
+    <w:lsdException w:name="Medium Grid 2 Accent 1" w:semiHidden="0" w:uiPriority="68" w:unhideWhenUsed="0"/>
+    <w:lsdException w:name="Medium Grid 3 Accent 1" w:semiHidden="0" w:uiPriority="69" w:unhideWhenUsed="0"/>
+    <w:lsdException w:name="Dark List Accent 1" w:semiHidden="0" w:uiPriority="70" w:unhideWhenUsed="0"/>
+    <w:lsdException w:name="Colorful Shading Accent 1" w:semiHidden="0" w:uiPriority="71" w:unhideWhenUsed="0"/>
+    <w:lsdException w:name="Colorful List Accent 1" w:semiHidden="0" w:uiPriority="72" w:unhideWhenUsed="0"/>
+    <w:lsdException w:name="Colorful Grid Accent 1" w:semiHidden="0" w:uiPriority="73" w:unhideWhenUsed="0"/>
+    <w:lsdException w:name="Light Shading Accent 2" w:semiHidden="0" w:uiPriority="60" w:unhideWhenUsed="0"/>
+    <w:lsdException w:name="Light List Accent 2" w:semiHidden="0" w:uiPriority="61" w:unhideWhenUsed="0"/>
+    <w:lsdException w:name="Light Grid Accent 2" w:semiHidden="0" w:uiPriority="62" w:unhideWhenUsed="0"/>
+    <w:lsdException w:name="Medium Shading 1 Accent 2" w:semiHidden="0" w:uiPriority="63" w:unhideWhenUsed="0"/>
+    <w:lsdException w:name="Medium Shading 2 Accent 2" w:semiHidden="0" w:uiPriority="64" w:unhideWhenUsed="0"/>
+    <w:lsdException w:name="Medium List 1 Accent 2" w:semiHidden="0" w:uiPriority="65" w:unhideWhenUsed="0"/>
+    <w:lsdException w:name="Medium List 2 Accent 2" w:semiHidden="0" w:uiPriority="66" w:unhideWhenUsed="0"/>
+    <w:lsdException w:name="Medium Grid 1 Accent 2" w:semiHidden="0" w:uiPriority="67" w:unhideWhenUsed="0"/>
+    <w:lsdException w:name="Medium Grid 2 Accent 2" w:semiHidden="0" w:uiPriority="68" w:unhideWhenUsed="0"/>
+    <w:lsdException w:name="Medium Grid 3 Accent 2" w:semiHidden="0" w:uiPriority="69" w:unhideWhenUsed="0"/>
+    <w:lsdException w:name="Dark List Accent 2" w:semiHidden="0" w:uiPriority="70" w:unhideWhenUsed="0"/>
+    <w:lsdException w:name="Colorful Shading Accent 2" w:semiHidden="0" w:uiPriority="71" w:unhideWhenUsed="0"/>
+    <w:lsdException w:name="Colorful List Accent 2" w:semiHidden="0" w:uiPriority="72" w:unhideWhenUsed="0"/>
+    <w:lsdException w:name="Colorful Grid Accent 2" w:semiHidden="0" w:uiPriority="73" w:unhideWhenUsed="0"/>
+    <w:lsdException w:name="Light Shading Accent 3" w:semiHidden="0" w:uiPriority="60" w:unhideWhenUsed="0"/>
+    <w:lsdException w:name="Light List Accent 3" w:semiHidden="0" w:uiPriority="61" w:unhideWhenUsed="0"/>
+    <w:lsdException w:name="Light Grid Accent 3" w:semiHidden="0" w:uiPriority="62" w:unhideWhenUsed="0"/>
+    <w:lsdException w:name="Medium Shading 1 Accent 3" w:semiHidden="0" w:uiPriority="63" w:unhideWhenUsed="0"/>
+    <w:lsdException w:name="Medium Shading 2 Accent 3" w:semiHidden="0" w:uiPriority="64" w:unhideWhenUsed="0"/>
+    <w:lsdException w:name="Medium List 1 Accent 3" w:semiHidden="0" w:uiPriority="65" w:unhideWhenUsed="0"/>
+    <w:lsdException w:name="Medium List 2 Accent 3" w:semiHidden="0" w:uiPriority="66" w:unhideWhenUsed="0"/>
+    <w:lsdException w:name="Medium Grid 1 Accent 3" w:semiHidden="0" w:uiPriority="67" w:unhideWhenUsed="0"/>
+    <w:lsdException w:name="Medium Grid 2 Accent 3" w:semiHidden="0" w:uiPriority="68" w:unhideWhenUsed="0"/>
+    <w:lsdException w:name="Medium Grid 3 Accent 3" w:semiHidden="0" w:uiPriority="69" w:unhideWhenUsed="0"/>
+    <w:lsdException w:name="Dark List Accent 3" w:semiHidden="0" w:uiPriority="70" w:unhideWhenUsed="0"/>
+    <w:lsdException w:name="Colorful Shading Accent 3" w:semiHidden="0" w:uiPriority="71" w:unhideWhenUsed="0"/>
+    <w:lsdException w:name="Colorful List Accent 3" w:semiHidden="0" w:uiPriority="72" w:unhideWhenUsed="0"/>
+    <w:lsdException w:name="Colorful Grid Accent 3" w:semiHidden="0" w:uiPriority="73" w:unhideWhenUsed="0"/>
+    <w:lsdException w:name="Light Shading Accent 4" w:semiHidden="0" w:uiPriority="60" w:unhideWhenUsed="0"/>
+    <w:lsdException w:name="Light List Accent 4" w:semiHidden="0" w:uiPriority="61" w:unhideWhenUsed="0"/>
+    <w:lsdException w:name="Light Grid Accent 4" w:semiHidden="0" w:uiPriority="62" w:unhideWhenUsed="0"/>
+    <w:lsdException w:name="Medium Shading 1 Accent 4" w:semiHidden="0" w:uiPriority="63" w:unhideWhenUsed="0"/>
+    <w:lsdException w:name="Medium Shading 2 Accent 4" w:semiHidden="0" w:uiPriority="64" w:unhideWhenUsed="0"/>
+    <w:lsdException w:name="Medium List 1 Accent 4" w:semiHidden="0" w:uiPriority="65" w:unhideWhenUsed="0"/>
+    <w:lsdException w:name="Medium List 2 Accent 4" w:semiHidden="0" w:uiPriority="66" w:unhideWhenUsed="0"/>
+    <w:lsdException w:name="Medium Grid 1 Accent 4" w:semiHidden="0" w:uiPriority="67" w:unhideWhenUsed="0"/>
+    <w:lsdException w:name="Medium Grid 2 Accent 4" w:semiHidden="0" w:uiPriority="68" w:unhideWhenUsed="0"/>
+    <w:lsdException w:name="Medium Grid 3 Accent 4" w:semiHidden="0" w:uiPriority="69" w:unhideWhenUsed="0"/>
+    <w:lsdException w:name="Dark List Accent 4" w:semiHidden="0" w:uiPriority="70" w:unhideWhenUsed="0"/>
+    <w:lsdException w:name="Colorful Shading Accent 4" w:semiHidden="0" w:uiPriority="71" w:unhideWhenUsed="0"/>
+    <w:lsdException w:name="Colorful List Accent 4" w:semiHidden="0" w:uiPriority="72" w:unhideWhenUsed="0"/>
+    <w:lsdException w:name="Colorful Grid Accent 4" w:semiHidden="0" w:uiPriority="73" w:unhideWhenUsed="0"/>
+    <w:lsdException w:name="Light Shading Accent 5" w:semiHidden="0" w:uiPriority="60" w:unhideWhenUsed="0"/>
+    <w:lsdException w:name="Light List Accent 5" w:semiHidden="0" w:uiPriority="61" w:unhideWhenUsed="0"/>
+    <w:lsdException w:name="Light Grid Accent 5" w:semiHidden="0" w:uiPriority="62" w:unhideWhenUsed="0"/>
+    <w:lsdException w:name="Medium Shading 1 Accent 5" w:semiHidden="0" w:uiPriority="63" w:unhideWhenUsed="0"/>
+    <w:lsdException w:name="Medium Shading 2 Accent 5" w:semiHidden="0" w:uiPriority="64" w:unhideWhenUsed="0"/>
+    <w:lsdException w:name="Medium List 1 Accent 5" w:semiHidden="0" w:uiPriority="65" w:unhideWhenUsed="0"/>
+    <w:lsdException w:name="Medium List 2 Accent 5" w:semiHidden="0" w:uiPriority="66" w:unhideWhenUsed="0"/>
+    <w:lsdException w:name="Medium Grid 1 Accent 5" w:semiHidden="0" w:uiPriority="67" w:unhideWhenUsed="0"/>
+    <w:lsdException w:name="Medium Grid 2 Accent 5" w:semiHidden="0" w:uiPriority="68" w:unhideWhenUsed="0"/>
+    <w:lsdException w:name="Medium Grid 3 Accent 5" w:semiHidden="0" w:uiPriority="69" w:unhideWhenUsed="0"/>
+    <w:lsdException w:name="Dark List Accent 5" w:semiHidden="0" w:uiPriority="70" w:unhideWhenUsed="0"/>
+    <w:lsdException w:name="Colorful Shading Accent 5" w:semiHidden="0" w:uiPriority="71" w:unhideWhenUsed="0"/>
+    <w:lsdException w:name="Colorful List Accent 5" w:semiHidden="0" w:uiPriority="72" w:unhideWhenUsed="0"/>
+    <w:lsdException w:name="Colorful Grid Accent 5" w:semiHidden="0" w:uiPriority="73" w:unhideWhenUsed="0"/>
+    <w:lsdException w:name="Light Shading Accent 6" w:semiHidden="0" w:uiPriority="60" w:unhideWhenUsed="0"/>
+    <w:lsdException w:name="Light List Accent 6" w:semiHidden="0" w:uiPriority="61" w:unhideWhenUsed="0"/>
+    <w:lsdException w:name="Light Grid Accent 6" w:semiHidden="0" w:uiPriority="62" w:unhideWhenUsed="0"/>
+    <w:lsdException w:name="Medium Shading 1 Accent 6" w:semiHidden="0" w:uiPriority="63" w:unhideWhenUsed="0"/>
+    <w:lsdException w:name="Medium Shading 2 Accent 6" w:semiHidden="0" w:uiPriority="64" w:unhideWhenUsed="0"/>
+    <w:lsdException w:name="Medium List 1 Accent 6" w:semiHidden="0" w:uiPriority="65" w:unhideWhenUsed="0"/>
+    <w:lsdException w:name="Medium List 2 Accent 6" w:semiHidden="0" w:uiPriority="66" w:unhideWhenUsed="0"/>
+    <w:lsdException w:name="Medium Grid 1 Accent 6" w:semiHidden="0" w:uiPriority="67" w:unhideWhenUsed="0"/>
+    <w:lsdException w:name="Medium Grid 2 Accent 6" w:semiHidden="0" w:uiPriority="68" w:unhideWhenUsed="0"/>
+    <w:lsdException w:name="Medium Grid 3 Accent 6" w:semiHidden="0" w:uiPriority="69" w:unhideWhenUsed="0"/>
+    <w:lsdException w:name="Dark List Accent 6" w:semiHidden="0" w:uiPriority="70" w:unhideWhenUsed="0"/>
+    <w:lsdException w:name="Colorful Shading Accent 6" w:semiHidden="0" w:uiPriority="71" w:unhideWhenUsed="0"/>
+    <w:lsdException w:name="Colorful List Accent 6" w:semiHidden="0" w:uiPriority="72" w:unhideWhenUsed="0"/>
+    <w:lsdException w:name="Colorful Grid Accent 6" w:semiHidden="0" w:uiPriority="73" w:unhideWhenUsed="0"/>
+    <w:lsdException w:name="Subtle Emphasis" w:semiHidden="0" w:uiPriority="19" w:unhideWhenUsed="0" w:qFormat="1"/>
+    <w:lsdException w:name="Intense Emphasis" w:semiHidden="0" w:uiPriority="21" w:unhideWhenUsed="0" w:qFormat="1"/>
+    <w:lsdException w:name="Subtle Reference" w:semiHidden="0" w:uiPriority="31" w:unhideWhenUsed="0" w:qFormat="1"/>
+    <w:lsdException w:name="Intense Reference" w:semiHidden="0" w:uiPriority="32" w:unhideWhenUsed="0" w:qFormat="1"/>
+    <w:lsdException w:name="Book Title" w:semiHidden="0" w:uiPriority="33" w:unhideWhenUsed="0" w:qFormat="1"/>
+    <w:lsdException w:name="Bibliography" w:uiPriority="37"/>
+    <w:lsdException w:name="TOC Heading" w:uiPriority="39" w:qFormat="1"/>
+  </w:latentStyles>
+  <w:style w:type="paragraph" w:default="1" w:styleId="Normal">
+    <w:name w:val="Normal"/>
+    <w:qFormat/>
+  </w:style>
+  <w:style w:type="character" w:default="1" w:styleId="DefaultParagraphFont">
+    <w:name w:val="Default Paragraph Font"/>
+    <w:uiPriority w:val="1"/>
+    <w:semiHidden/>
+    <w:unhideWhenUsed/>
+  </w:style>
+  <w:style w:type="table" w:default="1" w:styleId="TableNormal">
+    <w:name w:val="Normal Table"/>
+    <w:uiPriority w:val="99"/>
+    <w:semiHidden/>
+    <w:unhideWhenUsed/>
+    <w:tblPr>
+      <w:tblInd w:w="0" w:type="dxa"/>
+      <w:tblCellMar>
+        <w:top w:w="0" w:type="dxa"/>
+        <w:left w:w="108" w:type="dxa"/>
+        <w:bottom w:w="0" w:type="dxa"/>
+        <w:right w:w="108" w:type="dxa"/>
+      </w:tblCellMar>
+    </w:tblPr>
+  </w:style>
+  <w:style w:type="numbering" w:default="1" w:styleId="NoList">
+    <w:name w:val="No List"/>
+    <w:uiPriority w:val="99"/>
+    <w:semiHidden/>
+    <w:unhideWhenUsed/>
+  </w:style>
+</w:styles>
 </file>
 
 <file path=word/theme/theme1.xml><?xml version="1.0" encoding="utf-8"?>

</xml_diff>

<commit_message>
regen(5R2-lead): bake bang ky 1x2 PLI_M70 (spec W1 + laneB B2) + gate vocab them 'cac thanh vien hop danh' (fix false-positive D6 PLI_M09)
</commit_message>
<xml_diff>
--- a/app/templates/PLI_M70.docx
+++ b/app/templates/PLI_M70.docx
@@ -362,28 +362,43 @@
         <w:t>Nơi nhận kết quả bản giấy (nếu có): {noi_nhan}</w:t>
       </w:r>
     </w:p>
-    <w:tbl xmlns:ns0="urn:orca:p1b-temp">
+    <w:tbl>
       <w:tblPr>
-        <w:tblW w:type="auto" w:w="0"/>
-        <w:tblLook w:firstColumn="1" w:firstRow="1" w:lastColumn="0" w:lastRow="0" w:noHBand="0" w:noVBand="1" w:val="04A0"/>
+        <w:tblW w:w="8640" w:type="dxa"/>
         <w:tblBorders>
-          <w:top w:val="single" w:sz="4" w:color="000000"/>
-          <w:left w:val="single" w:sz="4" w:color="000000"/>
-          <w:bottom w:val="single" w:sz="4" w:color="000000"/>
-          <w:right w:val="single" w:sz="4" w:color="000000"/>
-          <w:insideH w:val="single" w:sz="4" w:color="000000"/>
-          <w:insideV w:val="single" w:sz="4" w:color="000000"/>
+          <w:top w:val="nil"/>
+          <w:left w:val="nil"/>
+          <w:bottom w:val="nil"/>
+          <w:right w:val="nil"/>
+          <w:insideH w:val="nil"/>
+          <w:insideV w:val="nil"/>
         </w:tblBorders>
+        <w:tblLayout w:type="fixed"/>
       </w:tblPr>
       <w:tblGrid>
-        <w:gridCol w:w="8640"/>
+        <w:gridCol w:w="4320"/>
+        <w:gridCol w:w="4320"/>
       </w:tblGrid>
       <w:tr>
+        <w:trPr>
+          <w:cantSplit/>
+          <w:trHeight w:val="1200" w:hRule="atLeast"/>
+        </w:trPr>
         <w:tc>
           <w:tcPr>
-            <w:tcW w:type="dxa" w:w="8640"/>
+            <w:tcW w:w="4320" w:type="dxa"/>
+            <w:tcBorders>
+              <w:top w:val="nil"/>
+              <w:left w:val="nil"/>
+              <w:bottom w:val="nil"/>
+              <w:right w:val="nil"/>
+            </w:tcBorders>
           </w:tcPr>
           <w:p>
+            <w:pPr>
+              <w:spacing w:before="120"/>
+              <w:jc w:val="center"/>
+            </w:pPr>
             <w:r>
               <w:rPr>
                 <w:b/>
@@ -393,14 +408,27 @@
               <w:t>(Ký và ghi họ tên)</w:t>
             </w:r>
           </w:p>
+          <w:p>
+            <w:pPr>
+              <w:spacing w:before="0" w:after="0" w:line="240" w:lineRule="exact"/>
+            </w:pPr>
+          </w:p>
         </w:tc>
-      </w:tr>
-      <w:tr>
         <w:tc>
           <w:tcPr>
-            <w:tcW w:type="dxa" w:w="8640"/>
+            <w:tcW w:w="4320" w:type="dxa"/>
+            <w:tcBorders>
+              <w:top w:val="nil"/>
+              <w:left w:val="nil"/>
+              <w:bottom w:val="nil"/>
+              <w:right w:val="nil"/>
+            </w:tcBorders>
           </w:tcPr>
           <w:p>
+            <w:pPr>
+              <w:spacing w:before="120"/>
+              <w:jc w:val="center"/>
+            </w:pPr>
             <w:r>
               <w:rPr>
                 <w:b/>
@@ -409,6 +437,11 @@
               <w:br/>
               <w:t>(Ký và ghi họ tên)</w:t>
             </w:r>
+          </w:p>
+          <w:p>
+            <w:pPr>
+              <w:spacing w:before="0" w:after="0" w:line="240" w:lineRule="exact"/>
+            </w:pPr>
           </w:p>
         </w:tc>
       </w:tr>

</xml_diff>

<commit_message>
6V-V4(signgap): vung viet o ky bang 1x2 bake build-time 240->800 twips (40pt) — render-time khong cham bien o; regen PLI_M70 (2 spacer 800, member-level x2 zero-diff) + evidence bottom-gap cho cum khong co dong duoi
</commit_message>
<xml_diff>
--- a/app/templates/PLI_M70.docx
+++ b/app/templates/PLI_M70.docx
@@ -410,7 +410,7 @@
           </w:p>
           <w:p>
             <w:pPr>
-              <w:spacing w:before="0" w:after="0" w:line="240" w:lineRule="exact"/>
+              <w:spacing w:before="0" w:after="0" w:line="800" w:lineRule="exact"/>
             </w:pPr>
           </w:p>
         </w:tc>
@@ -440,7 +440,7 @@
           </w:p>
           <w:p>
             <w:pPr>
-              <w:spacing w:before="0" w:after="0" w:line="240" w:lineRule="exact"/>
+              <w:spacing w:before="0" w:after="0" w:line="800" w:lineRule="exact"/>
             </w:pPr>
           </w:p>
         </w:tc>

</xml_diff>